<commit_message>
fix: update nama dan nim kuis 1
</commit_message>
<xml_diff>
--- a/Kuis 1_Algoritma dan Pemrograman.docx
+++ b/Kuis 1_Algoritma dan Pemrograman.docx
@@ -18,6 +18,76 @@
         </w:rPr>
         <w:t>KUIS 1</w:t>
       </w:r>
+    </w:p>
+    <w:p>
+      <w:pPr>
+        <w:rPr>
+          <w:rFonts w:ascii="Times New Roman" w:hAnsi="Times New Roman" w:cs="Times New Roman"/>
+          <w:b/>
+          <w:bCs/>
+        </w:rPr>
+      </w:pPr>
+      <w:r>
+        <w:rPr>
+          <w:rFonts w:ascii="Times New Roman" w:hAnsi="Times New Roman" w:cs="Times New Roman"/>
+          <w:b/>
+          <w:bCs/>
+        </w:rPr>
+        <w:t>Nama: Eka Elsanti</w:t>
+      </w:r>
+    </w:p>
+    <w:p>
+      <w:pPr>
+        <w:rPr>
+          <w:rFonts w:ascii="Times New Roman" w:hAnsi="Times New Roman" w:cs="Times New Roman"/>
+          <w:b/>
+          <w:bCs/>
+        </w:rPr>
+      </w:pPr>
+      <w:proofErr w:type="spellStart"/>
+      <w:r>
+        <w:rPr>
+          <w:rFonts w:ascii="Times New Roman" w:hAnsi="Times New Roman" w:cs="Times New Roman"/>
+          <w:b/>
+          <w:bCs/>
+        </w:rPr>
+        <w:t>Nim</w:t>
+      </w:r>
+      <w:proofErr w:type="spellEnd"/>
+      <w:r>
+        <w:rPr>
+          <w:rFonts w:ascii="Times New Roman" w:hAnsi="Times New Roman" w:cs="Times New Roman"/>
+          <w:b/>
+          <w:bCs/>
+        </w:rPr>
+        <w:t>: 2225250059</w:t>
+      </w:r>
+    </w:p>
+    <w:p>
+      <w:pPr>
+        <w:rPr>
+          <w:rFonts w:ascii="Times New Roman" w:hAnsi="Times New Roman" w:cs="Times New Roman"/>
+          <w:b/>
+          <w:bCs/>
+        </w:rPr>
+      </w:pPr>
+      <w:r>
+        <w:rPr>
+          <w:rFonts w:ascii="Times New Roman" w:hAnsi="Times New Roman" w:cs="Times New Roman"/>
+          <w:b/>
+          <w:bCs/>
+        </w:rPr>
+        <w:t>Kelas: 3A</w:t>
+      </w:r>
+    </w:p>
+    <w:p>
+      <w:pPr>
+        <w:rPr>
+          <w:rFonts w:ascii="Times New Roman" w:hAnsi="Times New Roman" w:cs="Times New Roman"/>
+          <w:b/>
+          <w:bCs/>
+        </w:rPr>
+      </w:pPr>
     </w:p>
     <w:tbl>
       <w:tblPr>

</xml_diff>